<commit_message>
El Word de correos lee el estado de flujos vivo, no el congelado
El generador leia correos.json, que es la sonda muerta del 20-ago. Por eso el
documento decia "78 en borrador" pasara lo que pasara: aunque el equipo
encendiera flujos, el Word repetia el mismo numero.

Ahora lee INV.flujos de correos-contenido.json, que se regenera en cada
corrida, y cae al archivo viejo solo si el nuevo no existe todavia. Ademas
imprime la fecha del corte, para que quien lo lea sepa de cuando es en vez de
suponer que es de hoy.

Regenerado con el dato del 24-ago: 148 flujos, 76 publicados y 72 en borrador,
contra el 149/71/78 que venia repitiendo desde el 20-ago.
</commit_message>
<xml_diff>
--- a/matriz-viral/entregables/4-Actualizar-correos-automatizaciones.docx
+++ b/matriz-viral/entregables/4-Actualizar-correos-automatizaciones.docx
@@ -127,7 +127,19 @@
           <w:sz w:val="21"/>
           <w:szCs w:val="21"/>
         </w:rPr>
-        <w:t xml:space="preserve">De los 149 flujos de la cuenta, 78 están en borrador. Ahí dentro está todo lo de nutrición y recontacto — el símbolo ⛔ del nombre no es decoración, es el estado real.</w:t>
+        <w:t xml:space="preserve">De los 148 flujos de la cuenta, 72 están en borrador. Ahí dentro está todo lo de nutrición y recontacto — el símbolo ⛔ del nombre no es decoración, es el estado real.</w:t>
+      </w:r>
+    </w:p>
+    <w:p>
+      <w:pPr>
+        <w:spacing w:after="80"/>
+      </w:pPr>
+      <w:r>
+        <w:rPr>
+          <w:sz w:val="21"/>
+          <w:szCs w:val="21"/>
+        </w:rPr>
+        <w:t xml:space="preserve">Corte del 2026-08-24. Este recuento se rehace en cada corrida, así que si el equipo enciende un flujo, la próxima versión de este documento ya lo refleja.</w:t>
       </w:r>
     </w:p>
     <w:tbl>
@@ -422,7 +434,7 @@
                 <w:sz w:val="18"/>
                 <w:szCs w:val="18"/>
               </w:rPr>
-              <w:t xml:space="preserve">Lead Recontacto Máster BIM+IA</w:t>
+              <w:t xml:space="preserve">Oportunidad Futura + Seguimiento</w:t>
             </w:r>
           </w:p>
         </w:tc>
@@ -452,7 +464,7 @@
                 <w:sz w:val="18"/>
                 <w:szCs w:val="18"/>
               </w:rPr>
-              <w:t xml:space="preserve">Oportunidad Futura + Seguimiento</w:t>
+              <w:t xml:space="preserve">⛔ Seguimientos Nutrición CORREOS - Acceso a Módulo 1 Diplomado</w:t>
             </w:r>
           </w:p>
         </w:tc>
@@ -482,7 +494,7 @@
                 <w:sz w:val="18"/>
                 <w:szCs w:val="18"/>
               </w:rPr>
-              <w:t xml:space="preserve">⛔ Seguimientos Nutrición CORREOS - Acceso a Módulo 1 Diplomado</w:t>
+              <w:t xml:space="preserve">⛔ Seguimientos Nutrición WHATSAPP - Acceso a Módulo 1 Diplomado</w:t>
             </w:r>
           </w:p>
         </w:tc>
@@ -512,97 +524,7 @@
                 <w:sz w:val="18"/>
                 <w:szCs w:val="18"/>
               </w:rPr>
-              <w:t xml:space="preserve">⛔ Seguimientos Nutrición WHATSAPP - Acceso a Módulo 1 Diplomado</w:t>
-            </w:r>
-          </w:p>
-        </w:tc>
-      </w:tr>
-      <w:tr>
-        <w:tc>
-          <w:tcPr>
-            <w:tcW w:type="dxa" w:w="1900"/>
-          </w:tcPr>
-          <w:p>
-            <w:r>
-              <w:rPr>
-                <w:sz w:val="18"/>
-                <w:szCs w:val="18"/>
-              </w:rPr>
-              <w:t xml:space="preserve">⛔ borrador</w:t>
-            </w:r>
-          </w:p>
-        </w:tc>
-        <w:tc>
-          <w:tcPr>
-            <w:tcW w:type="dxa" w:w="8600"/>
-          </w:tcPr>
-          <w:p>
-            <w:r>
-              <w:rPr>
-                <w:sz w:val="18"/>
-                <w:szCs w:val="18"/>
-              </w:rPr>
               <w:t xml:space="preserve">⛔ Seguimientos Nutrición WHATSAPP - Generación de interés</w:t>
-            </w:r>
-          </w:p>
-        </w:tc>
-      </w:tr>
-      <w:tr>
-        <w:tc>
-          <w:tcPr>
-            <w:tcW w:type="dxa" w:w="1900"/>
-          </w:tcPr>
-          <w:p>
-            <w:r>
-              <w:rPr>
-                <w:sz w:val="18"/>
-                <w:szCs w:val="18"/>
-              </w:rPr>
-              <w:t xml:space="preserve">⛔ borrador</w:t>
-            </w:r>
-          </w:p>
-        </w:tc>
-        <w:tc>
-          <w:tcPr>
-            <w:tcW w:type="dxa" w:w="8600"/>
-          </w:tcPr>
-          <w:p>
-            <w:r>
-              <w:rPr>
-                <w:sz w:val="18"/>
-                <w:szCs w:val="18"/>
-              </w:rPr>
-              <w:t xml:space="preserve">Seguimiento Correo + Oportunidad Futura (Cursos)</w:t>
-            </w:r>
-          </w:p>
-        </w:tc>
-      </w:tr>
-      <w:tr>
-        <w:tc>
-          <w:tcPr>
-            <w:tcW w:type="dxa" w:w="1900"/>
-          </w:tcPr>
-          <w:p>
-            <w:r>
-              <w:rPr>
-                <w:sz w:val="18"/>
-                <w:szCs w:val="18"/>
-              </w:rPr>
-              <w:t xml:space="preserve">⛔ borrador</w:t>
-            </w:r>
-          </w:p>
-        </w:tc>
-        <w:tc>
-          <w:tcPr>
-            <w:tcW w:type="dxa" w:w="8600"/>
-          </w:tcPr>
-          <w:p>
-            <w:r>
-              <w:rPr>
-                <w:sz w:val="18"/>
-                <w:szCs w:val="18"/>
-              </w:rPr>
-              <w:t xml:space="preserve">✅ Oportunidad Futura (Comunidad + Nurture + Oferta)</w:t>
             </w:r>
           </w:p>
         </w:tc>
@@ -651,7 +573,7 @@
           <w:sz w:val="21"/>
           <w:szCs w:val="21"/>
         </w:rPr>
-        <w:t xml:space="preserve">Hay 20 plantillas con el nombre repetido y 21 copias de más: versiones con 🟢, sin 🟢 y alguna marcada (clone).</w:t>
+        <w:t xml:space="preserve">Hay 19 plantillas con el nombre repetido y 20 copias de más: versiones con 🟢, sin 🟢 y alguna marcada (clone).</w:t>
       </w:r>
     </w:p>
     <w:tbl>
@@ -826,7 +748,7 @@
                 <w:sz w:val="18"/>
                 <w:szCs w:val="18"/>
               </w:rPr>
-              <w:t xml:space="preserve">MASTER1AD - Se confirma agenda Bienvenida agenda</w:t>
+              <w:t xml:space="preserve">MASTER1AD - Se confirma agenda Correo 6hs antes</w:t>
             </w:r>
           </w:p>
         </w:tc>
@@ -856,7 +778,7 @@
                 <w:sz w:val="18"/>
                 <w:szCs w:val="18"/>
               </w:rPr>
-              <w:t xml:space="preserve">MASTER1AD - Se confirma agenda Correo 6hs antes</w:t>
+              <w:t xml:space="preserve">(E1) Lead mal encaje-Correo01</w:t>
             </w:r>
           </w:p>
         </w:tc>
@@ -886,7 +808,7 @@
                 <w:sz w:val="18"/>
                 <w:szCs w:val="18"/>
               </w:rPr>
-              <w:t xml:space="preserve">(E1) Lead mal encaje-Correo01</w:t>
+              <w:t xml:space="preserve">(E2) Lead sin calificar-Correo04</w:t>
             </w:r>
           </w:p>
         </w:tc>
@@ -916,7 +838,7 @@
                 <w:sz w:val="18"/>
                 <w:szCs w:val="18"/>
               </w:rPr>
-              <w:t xml:space="preserve">(E2) Lead sin calificar-Correo04</w:t>
+              <w:t xml:space="preserve">(E4) Oportunidad-Correo12</w:t>
             </w:r>
           </w:p>
         </w:tc>
@@ -946,7 +868,7 @@
                 <w:sz w:val="18"/>
                 <w:szCs w:val="18"/>
               </w:rPr>
-              <w:t xml:space="preserve">(E4) Oportunidad-Correo12</w:t>
+              <w:t xml:space="preserve">(E4) Oportunidad-Correo11</w:t>
             </w:r>
           </w:p>
         </w:tc>
@@ -976,7 +898,7 @@
                 <w:sz w:val="18"/>
                 <w:szCs w:val="18"/>
               </w:rPr>
-              <w:t xml:space="preserve">(E4) Oportunidad-Correo11</w:t>
+              <w:t xml:space="preserve">(E3) MQL-Correo09</w:t>
             </w:r>
           </w:p>
         </w:tc>
@@ -1006,7 +928,7 @@
                 <w:sz w:val="18"/>
                 <w:szCs w:val="18"/>
               </w:rPr>
-              <w:t xml:space="preserve">(E3) MQL-Correo09</w:t>
+              <w:t xml:space="preserve">(E2) Lead sin calificar-Correo06</w:t>
             </w:r>
           </w:p>
         </w:tc>

</xml_diff>